<commit_message>
chore: latest version of files
</commit_message>
<xml_diff>
--- a/PRISMA_2020_flow_diagram_new_SRs_v1.docx
+++ b/PRISMA_2020_flow_diagram_new_SRs_v1.docx
@@ -2973,6 +2973,11 @@
       <w:pPr>
         <w:spacing w:after="0" w:line="240" w:lineRule="auto"/>
       </w:pPr>
+    </w:p>
+    <w:p>
+      <w:pPr>
+        <w:spacing w:after="0" w:line="240" w:lineRule="auto"/>
+      </w:pPr>
       <w:r>
         <w:rPr>
           <w:noProof/>
@@ -2980,531 +2985,7 @@
         <mc:AlternateContent>
           <mc:Choice Requires="wps">
             <w:drawing>
-              <wp:anchor distT="0" distB="0" distL="114300" distR="114300" simplePos="0" relativeHeight="251671552" behindDoc="0" locked="0" layoutInCell="1" allowOverlap="1" wp14:anchorId="0A6784D8" wp14:editId="790D70EE">
-                <wp:simplePos x="0" y="0"/>
-                <wp:positionH relativeFrom="column">
-                  <wp:posOffset>3063240</wp:posOffset>
-                </wp:positionH>
-                <wp:positionV relativeFrom="paragraph">
-                  <wp:posOffset>59358</wp:posOffset>
-                </wp:positionV>
-                <wp:extent cx="1887220" cy="1133475"/>
-                <wp:effectExtent l="0" t="0" r="17780" b="28575"/>
-                <wp:wrapNone/>
-                <wp:docPr id="9" name="Rectangle 9"/>
-                <wp:cNvGraphicFramePr/>
-                <a:graphic xmlns:a="http://schemas.openxmlformats.org/drawingml/2006/main">
-                  <a:graphicData uri="http://schemas.microsoft.com/office/word/2010/wordprocessingShape">
-                    <wps:wsp>
-                      <wps:cNvSpPr/>
-                      <wps:spPr>
-                        <a:xfrm>
-                          <a:off x="0" y="0"/>
-                          <a:ext cx="1887220" cy="1133475"/>
-                        </a:xfrm>
-                        <a:prstGeom prst="rect">
-                          <a:avLst/>
-                        </a:prstGeom>
-                        <a:noFill/>
-                        <a:ln>
-                          <a:solidFill>
-                            <a:schemeClr val="tx1"/>
-                          </a:solidFill>
-                        </a:ln>
-                      </wps:spPr>
-                      <wps:style>
-                        <a:lnRef idx="2">
-                          <a:schemeClr val="accent1">
-                            <a:shade val="50000"/>
-                          </a:schemeClr>
-                        </a:lnRef>
-                        <a:fillRef idx="1">
-                          <a:schemeClr val="accent1"/>
-                        </a:fillRef>
-                        <a:effectRef idx="0">
-                          <a:schemeClr val="accent1"/>
-                        </a:effectRef>
-                        <a:fontRef idx="minor">
-                          <a:schemeClr val="lt1"/>
-                        </a:fontRef>
-                      </wps:style>
-                      <wps:txbx>
-                        <w:txbxContent>
-                          <w:p>
-                            <w:pPr>
-                              <w:spacing w:after="0" w:line="240" w:lineRule="auto"/>
-                              <w:rPr>
-                                <w:rFonts w:ascii="Arial" w:hAnsi="Arial" w:cs="Arial"/>
-                                <w:color w:val="000000" w:themeColor="text1"/>
-                                <w:sz w:val="18"/>
-                                <w:szCs w:val="20"/>
-                              </w:rPr>
-                            </w:pPr>
-                            <w:r>
-                              <w:rPr>
-                                <w:rFonts w:ascii="Arial" w:hAnsi="Arial" w:cs="Arial"/>
-                                <w:color w:val="000000" w:themeColor="text1"/>
-                                <w:sz w:val="18"/>
-                                <w:szCs w:val="20"/>
-                              </w:rPr>
-                              <w:t>Re</w:t>
-                            </w:r>
-                            <w:r>
-                              <w:rPr>
-                                <w:rFonts w:ascii="Arial" w:hAnsi="Arial" w:cs="Arial"/>
-                                <w:color w:val="000000" w:themeColor="text1"/>
-                                <w:sz w:val="18"/>
-                                <w:szCs w:val="20"/>
-                              </w:rPr>
-                              <w:t>p</w:t>
-                            </w:r>
-                            <w:r>
-                              <w:rPr>
-                                <w:rFonts w:ascii="Arial" w:hAnsi="Arial" w:cs="Arial"/>
-                                <w:color w:val="000000" w:themeColor="text1"/>
-                                <w:sz w:val="18"/>
-                                <w:szCs w:val="20"/>
-                              </w:rPr>
-                              <w:t>or</w:t>
-                            </w:r>
-                            <w:r>
-                              <w:rPr>
-                                <w:rFonts w:ascii="Arial" w:hAnsi="Arial" w:cs="Arial"/>
-                                <w:color w:val="000000" w:themeColor="text1"/>
-                                <w:sz w:val="18"/>
-                                <w:szCs w:val="20"/>
-                              </w:rPr>
-                              <w:t>t</w:t>
-                            </w:r>
-                            <w:r>
-                              <w:rPr>
-                                <w:rFonts w:ascii="Arial" w:hAnsi="Arial" w:cs="Arial"/>
-                                <w:color w:val="000000" w:themeColor="text1"/>
-                                <w:sz w:val="18"/>
-                                <w:szCs w:val="20"/>
-                              </w:rPr>
-                              <w:t>s</w:t>
-                            </w:r>
-                            <w:r>
-                              <w:rPr>
-                                <w:rFonts w:ascii="Arial" w:hAnsi="Arial" w:cs="Arial"/>
-                                <w:color w:val="000000" w:themeColor="text1"/>
-                                <w:sz w:val="18"/>
-                                <w:szCs w:val="20"/>
-                              </w:rPr>
-                              <w:t xml:space="preserve"> excluded</w:t>
-                            </w:r>
-                            <w:r>
-                              <w:rPr>
-                                <w:rFonts w:ascii="Arial" w:hAnsi="Arial" w:cs="Arial"/>
-                                <w:color w:val="000000" w:themeColor="text1"/>
-                                <w:sz w:val="18"/>
-                                <w:szCs w:val="20"/>
-                              </w:rPr>
-                              <w:t>:</w:t>
-                            </w:r>
-                          </w:p>
-                          <w:p>
-                            <w:pPr>
-                              <w:spacing w:after="0" w:line="240" w:lineRule="auto"/>
-                              <w:ind w:left="284"/>
-                              <w:rPr>
-                                <w:rFonts w:ascii="Arial" w:hAnsi="Arial" w:cs="Arial"/>
-                                <w:color w:val="000000" w:themeColor="text1"/>
-                                <w:sz w:val="18"/>
-                                <w:szCs w:val="20"/>
-                              </w:rPr>
-                            </w:pPr>
-                            <w:r>
-                              <w:rPr>
-                                <w:rFonts w:ascii="Arial" w:hAnsi="Arial" w:cs="Arial"/>
-                                <w:color w:val="000000" w:themeColor="text1"/>
-                                <w:sz w:val="18"/>
-                                <w:szCs w:val="20"/>
-                              </w:rPr>
-                              <w:t>Not relevant</w:t>
-                            </w:r>
-                            <w:r>
-                              <w:rPr>
-                                <w:rFonts w:ascii="Arial" w:hAnsi="Arial" w:cs="Arial"/>
-                                <w:color w:val="000000" w:themeColor="text1"/>
-                                <w:sz w:val="18"/>
-                                <w:szCs w:val="20"/>
-                              </w:rPr>
-                              <w:t xml:space="preserve"> (</w:t>
-                            </w:r>
-                            <w:r>
-                              <w:rPr>
-                                <w:rFonts w:ascii="Arial" w:hAnsi="Arial" w:cs="Arial"/>
-                                <w:color w:val="000000" w:themeColor="text1"/>
-                                <w:sz w:val="18"/>
-                                <w:szCs w:val="20"/>
-                              </w:rPr>
-                              <w:t>n</w:t>
-                            </w:r>
-                            <w:r>
-                              <w:rPr>
-                                <w:rFonts w:ascii="Arial" w:hAnsi="Arial" w:cs="Arial"/>
-                                <w:color w:val="000000" w:themeColor="text1"/>
-                                <w:sz w:val="18"/>
-                                <w:szCs w:val="20"/>
-                              </w:rPr>
-                              <w:t xml:space="preserve"> = </w:t>
-                            </w:r>
-                            <w:r>
-                              <w:rPr>
-                                <w:rFonts w:ascii="Arial" w:hAnsi="Arial" w:cs="Arial"/>
-                                <w:color w:val="000000" w:themeColor="text1"/>
-                                <w:sz w:val="18"/>
-                                <w:szCs w:val="20"/>
-                              </w:rPr>
-                              <w:t>17</w:t>
-                            </w:r>
-                            <w:r>
-                              <w:rPr>
-                                <w:rFonts w:ascii="Arial" w:hAnsi="Arial" w:cs="Arial"/>
-                                <w:color w:val="000000" w:themeColor="text1"/>
-                                <w:sz w:val="18"/>
-                                <w:szCs w:val="20"/>
-                              </w:rPr>
-                              <w:t>7</w:t>
-                            </w:r>
-                            <w:r>
-                              <w:rPr>
-                                <w:rFonts w:ascii="Arial" w:hAnsi="Arial" w:cs="Arial"/>
-                                <w:color w:val="000000" w:themeColor="text1"/>
-                                <w:sz w:val="18"/>
-                                <w:szCs w:val="20"/>
-                              </w:rPr>
-                              <w:t>)</w:t>
-                            </w:r>
-                          </w:p>
-                          <w:p>
-                            <w:pPr>
-                              <w:spacing w:after="0" w:line="240" w:lineRule="auto"/>
-                              <w:ind w:left="284"/>
-                              <w:rPr>
-                                <w:rFonts w:ascii="Arial" w:hAnsi="Arial" w:cs="Arial"/>
-                                <w:color w:val="000000" w:themeColor="text1"/>
-                                <w:sz w:val="18"/>
-                                <w:szCs w:val="20"/>
-                              </w:rPr>
-                            </w:pPr>
-                            <w:r>
-                              <w:rPr>
-                                <w:rFonts w:ascii="Arial" w:hAnsi="Arial" w:cs="Arial"/>
-                                <w:color w:val="000000" w:themeColor="text1"/>
-                                <w:sz w:val="18"/>
-                                <w:szCs w:val="20"/>
-                              </w:rPr>
-                              <w:t xml:space="preserve">No empirical contribution </w:t>
-                            </w:r>
-                            <w:r>
-                              <w:rPr>
-                                <w:rFonts w:ascii="Arial" w:hAnsi="Arial" w:cs="Arial"/>
-                                <w:color w:val="000000" w:themeColor="text1"/>
-                                <w:sz w:val="18"/>
-                                <w:szCs w:val="20"/>
-                              </w:rPr>
-                              <w:t>(</w:t>
-                            </w:r>
-                            <w:r>
-                              <w:rPr>
-                                <w:rFonts w:ascii="Arial" w:hAnsi="Arial" w:cs="Arial"/>
-                                <w:color w:val="000000" w:themeColor="text1"/>
-                                <w:sz w:val="18"/>
-                                <w:szCs w:val="20"/>
-                              </w:rPr>
-                              <w:t>n</w:t>
-                            </w:r>
-                            <w:r>
-                              <w:rPr>
-                                <w:rFonts w:ascii="Arial" w:hAnsi="Arial" w:cs="Arial"/>
-                                <w:color w:val="000000" w:themeColor="text1"/>
-                                <w:sz w:val="18"/>
-                                <w:szCs w:val="20"/>
-                              </w:rPr>
-                              <w:t xml:space="preserve"> = </w:t>
-                            </w:r>
-                            <w:r>
-                              <w:rPr>
-                                <w:rFonts w:ascii="Arial" w:hAnsi="Arial" w:cs="Arial"/>
-                                <w:color w:val="000000" w:themeColor="text1"/>
-                                <w:sz w:val="18"/>
-                                <w:szCs w:val="20"/>
-                              </w:rPr>
-                              <w:t>36</w:t>
-                            </w:r>
-                            <w:r>
-                              <w:rPr>
-                                <w:rFonts w:ascii="Arial" w:hAnsi="Arial" w:cs="Arial"/>
-                                <w:color w:val="000000" w:themeColor="text1"/>
-                                <w:sz w:val="18"/>
-                                <w:szCs w:val="20"/>
-                              </w:rPr>
-                              <w:t>)</w:t>
-                            </w:r>
-                          </w:p>
-                        </w:txbxContent>
-                      </wps:txbx>
-                      <wps:bodyPr rot="0" spcFirstLastPara="0" vertOverflow="overflow" horzOverflow="overflow" vert="horz" wrap="square" lIns="91440" tIns="45720" rIns="91440" bIns="45720" numCol="1" spcCol="0" rtlCol="0" fromWordArt="0" anchor="ctr" anchorCtr="0" forceAA="0" compatLnSpc="1">
-                        <a:prstTxWarp prst="textNoShape">
-                          <a:avLst/>
-                        </a:prstTxWarp>
-                        <a:noAutofit/>
-                      </wps:bodyPr>
-                    </wps:wsp>
-                  </a:graphicData>
-                </a:graphic>
-                <wp14:sizeRelH relativeFrom="margin">
-                  <wp14:pctWidth>0</wp14:pctWidth>
-                </wp14:sizeRelH>
-                <wp14:sizeRelV relativeFrom="margin">
-                  <wp14:pctHeight>0</wp14:pctHeight>
-                </wp14:sizeRelV>
-              </wp:anchor>
-            </w:drawing>
-          </mc:Choice>
-          <mc:Fallback>
-            <w:pict>
-              <v:rect w14:anchorId="0A6784D8" id="Rectangle 9" o:spid="_x0000_s1034" style="position:absolute;margin-left:241.2pt;margin-top:4.65pt;width:148.6pt;height:89.25pt;z-index:251671552;visibility:visible;mso-wrap-style:square;mso-width-percent:0;mso-height-percent:0;mso-wrap-distance-left:9pt;mso-wrap-distance-top:0;mso-wrap-distance-right:9pt;mso-wrap-distance-bottom:0;mso-position-horizontal:absolute;mso-position-horizontal-relative:text;mso-position-vertical:absolute;mso-position-vertical-relative:text;mso-width-percent:0;mso-height-percent:0;mso-width-relative:margin;mso-height-relative:margin;v-text-anchor:middle" o:gfxdata="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" filled="f" strokecolor="black [3213]" strokeweight="1pt">
-                <v:textbox>
-                  <w:txbxContent>
-                    <w:p>
-                      <w:pPr>
-                        <w:spacing w:after="0" w:line="240" w:lineRule="auto"/>
-                        <w:rPr>
-                          <w:rFonts w:ascii="Arial" w:hAnsi="Arial" w:cs="Arial"/>
-                          <w:color w:val="000000" w:themeColor="text1"/>
-                          <w:sz w:val="18"/>
-                          <w:szCs w:val="20"/>
-                        </w:rPr>
-                      </w:pPr>
-                      <w:r>
-                        <w:rPr>
-                          <w:rFonts w:ascii="Arial" w:hAnsi="Arial" w:cs="Arial"/>
-                          <w:color w:val="000000" w:themeColor="text1"/>
-                          <w:sz w:val="18"/>
-                          <w:szCs w:val="20"/>
-                        </w:rPr>
-                        <w:t>Re</w:t>
-                      </w:r>
-                      <w:r>
-                        <w:rPr>
-                          <w:rFonts w:ascii="Arial" w:hAnsi="Arial" w:cs="Arial"/>
-                          <w:color w:val="000000" w:themeColor="text1"/>
-                          <w:sz w:val="18"/>
-                          <w:szCs w:val="20"/>
-                        </w:rPr>
-                        <w:t>p</w:t>
-                      </w:r>
-                      <w:r>
-                        <w:rPr>
-                          <w:rFonts w:ascii="Arial" w:hAnsi="Arial" w:cs="Arial"/>
-                          <w:color w:val="000000" w:themeColor="text1"/>
-                          <w:sz w:val="18"/>
-                          <w:szCs w:val="20"/>
-                        </w:rPr>
-                        <w:t>or</w:t>
-                      </w:r>
-                      <w:r>
-                        <w:rPr>
-                          <w:rFonts w:ascii="Arial" w:hAnsi="Arial" w:cs="Arial"/>
-                          <w:color w:val="000000" w:themeColor="text1"/>
-                          <w:sz w:val="18"/>
-                          <w:szCs w:val="20"/>
-                        </w:rPr>
-                        <w:t>t</w:t>
-                      </w:r>
-                      <w:r>
-                        <w:rPr>
-                          <w:rFonts w:ascii="Arial" w:hAnsi="Arial" w:cs="Arial"/>
-                          <w:color w:val="000000" w:themeColor="text1"/>
-                          <w:sz w:val="18"/>
-                          <w:szCs w:val="20"/>
-                        </w:rPr>
-                        <w:t>s</w:t>
-                      </w:r>
-                      <w:r>
-                        <w:rPr>
-                          <w:rFonts w:ascii="Arial" w:hAnsi="Arial" w:cs="Arial"/>
-                          <w:color w:val="000000" w:themeColor="text1"/>
-                          <w:sz w:val="18"/>
-                          <w:szCs w:val="20"/>
-                        </w:rPr>
-                        <w:t xml:space="preserve"> excluded</w:t>
-                      </w:r>
-                      <w:r>
-                        <w:rPr>
-                          <w:rFonts w:ascii="Arial" w:hAnsi="Arial" w:cs="Arial"/>
-                          <w:color w:val="000000" w:themeColor="text1"/>
-                          <w:sz w:val="18"/>
-                          <w:szCs w:val="20"/>
-                        </w:rPr>
-                        <w:t>:</w:t>
-                      </w:r>
-                    </w:p>
-                    <w:p>
-                      <w:pPr>
-                        <w:spacing w:after="0" w:line="240" w:lineRule="auto"/>
-                        <w:ind w:left="284"/>
-                        <w:rPr>
-                          <w:rFonts w:ascii="Arial" w:hAnsi="Arial" w:cs="Arial"/>
-                          <w:color w:val="000000" w:themeColor="text1"/>
-                          <w:sz w:val="18"/>
-                          <w:szCs w:val="20"/>
-                        </w:rPr>
-                      </w:pPr>
-                      <w:r>
-                        <w:rPr>
-                          <w:rFonts w:ascii="Arial" w:hAnsi="Arial" w:cs="Arial"/>
-                          <w:color w:val="000000" w:themeColor="text1"/>
-                          <w:sz w:val="18"/>
-                          <w:szCs w:val="20"/>
-                        </w:rPr>
-                        <w:t>Not relevant</w:t>
-                      </w:r>
-                      <w:r>
-                        <w:rPr>
-                          <w:rFonts w:ascii="Arial" w:hAnsi="Arial" w:cs="Arial"/>
-                          <w:color w:val="000000" w:themeColor="text1"/>
-                          <w:sz w:val="18"/>
-                          <w:szCs w:val="20"/>
-                        </w:rPr>
-                        <w:t xml:space="preserve"> (</w:t>
-                      </w:r>
-                      <w:r>
-                        <w:rPr>
-                          <w:rFonts w:ascii="Arial" w:hAnsi="Arial" w:cs="Arial"/>
-                          <w:color w:val="000000" w:themeColor="text1"/>
-                          <w:sz w:val="18"/>
-                          <w:szCs w:val="20"/>
-                        </w:rPr>
-                        <w:t>n</w:t>
-                      </w:r>
-                      <w:r>
-                        <w:rPr>
-                          <w:rFonts w:ascii="Arial" w:hAnsi="Arial" w:cs="Arial"/>
-                          <w:color w:val="000000" w:themeColor="text1"/>
-                          <w:sz w:val="18"/>
-                          <w:szCs w:val="20"/>
-                        </w:rPr>
-                        <w:t xml:space="preserve"> = </w:t>
-                      </w:r>
-                      <w:r>
-                        <w:rPr>
-                          <w:rFonts w:ascii="Arial" w:hAnsi="Arial" w:cs="Arial"/>
-                          <w:color w:val="000000" w:themeColor="text1"/>
-                          <w:sz w:val="18"/>
-                          <w:szCs w:val="20"/>
-                        </w:rPr>
-                        <w:t>17</w:t>
-                      </w:r>
-                      <w:r>
-                        <w:rPr>
-                          <w:rFonts w:ascii="Arial" w:hAnsi="Arial" w:cs="Arial"/>
-                          <w:color w:val="000000" w:themeColor="text1"/>
-                          <w:sz w:val="18"/>
-                          <w:szCs w:val="20"/>
-                        </w:rPr>
-                        <w:t>7</w:t>
-                      </w:r>
-                      <w:r>
-                        <w:rPr>
-                          <w:rFonts w:ascii="Arial" w:hAnsi="Arial" w:cs="Arial"/>
-                          <w:color w:val="000000" w:themeColor="text1"/>
-                          <w:sz w:val="18"/>
-                          <w:szCs w:val="20"/>
-                        </w:rPr>
-                        <w:t>)</w:t>
-                      </w:r>
-                    </w:p>
-                    <w:p>
-                      <w:pPr>
-                        <w:spacing w:after="0" w:line="240" w:lineRule="auto"/>
-                        <w:ind w:left="284"/>
-                        <w:rPr>
-                          <w:rFonts w:ascii="Arial" w:hAnsi="Arial" w:cs="Arial"/>
-                          <w:color w:val="000000" w:themeColor="text1"/>
-                          <w:sz w:val="18"/>
-                          <w:szCs w:val="20"/>
-                        </w:rPr>
-                      </w:pPr>
-                      <w:r>
-                        <w:rPr>
-                          <w:rFonts w:ascii="Arial" w:hAnsi="Arial" w:cs="Arial"/>
-                          <w:color w:val="000000" w:themeColor="text1"/>
-                          <w:sz w:val="18"/>
-                          <w:szCs w:val="20"/>
-                        </w:rPr>
-                        <w:t xml:space="preserve">No empirical contribution </w:t>
-                      </w:r>
-                      <w:r>
-                        <w:rPr>
-                          <w:rFonts w:ascii="Arial" w:hAnsi="Arial" w:cs="Arial"/>
-                          <w:color w:val="000000" w:themeColor="text1"/>
-                          <w:sz w:val="18"/>
-                          <w:szCs w:val="20"/>
-                        </w:rPr>
-                        <w:t>(</w:t>
-                      </w:r>
-                      <w:r>
-                        <w:rPr>
-                          <w:rFonts w:ascii="Arial" w:hAnsi="Arial" w:cs="Arial"/>
-                          <w:color w:val="000000" w:themeColor="text1"/>
-                          <w:sz w:val="18"/>
-                          <w:szCs w:val="20"/>
-                        </w:rPr>
-                        <w:t>n</w:t>
-                      </w:r>
-                      <w:r>
-                        <w:rPr>
-                          <w:rFonts w:ascii="Arial" w:hAnsi="Arial" w:cs="Arial"/>
-                          <w:color w:val="000000" w:themeColor="text1"/>
-                          <w:sz w:val="18"/>
-                          <w:szCs w:val="20"/>
-                        </w:rPr>
-                        <w:t xml:space="preserve"> = </w:t>
-                      </w:r>
-                      <w:r>
-                        <w:rPr>
-                          <w:rFonts w:ascii="Arial" w:hAnsi="Arial" w:cs="Arial"/>
-                          <w:color w:val="000000" w:themeColor="text1"/>
-                          <w:sz w:val="18"/>
-                          <w:szCs w:val="20"/>
-                        </w:rPr>
-                        <w:t>36</w:t>
-                      </w:r>
-                      <w:r>
-                        <w:rPr>
-                          <w:rFonts w:ascii="Arial" w:hAnsi="Arial" w:cs="Arial"/>
-                          <w:color w:val="000000" w:themeColor="text1"/>
-                          <w:sz w:val="18"/>
-                          <w:szCs w:val="20"/>
-                        </w:rPr>
-                        <w:t>)</w:t>
-                      </w:r>
-                    </w:p>
-                  </w:txbxContent>
-                </v:textbox>
-              </v:rect>
-            </w:pict>
-          </mc:Fallback>
-        </mc:AlternateContent>
-      </w:r>
-    </w:p>
-    <w:p>
-      <w:pPr>
-        <w:spacing w:after="0" w:line="240" w:lineRule="auto"/>
-      </w:pPr>
-      <w:r>
-        <w:rPr>
-          <w:noProof/>
-        </w:rPr>
-        <mc:AlternateContent>
-          <mc:Choice Requires="wps">
-            <w:drawing>
-              <wp:anchor distT="0" distB="0" distL="114300" distR="114300" simplePos="0" relativeHeight="251670528" behindDoc="0" locked="0" layoutInCell="1" allowOverlap="1" wp14:anchorId="256BB765" wp14:editId="4A1ABC00">
+              <wp:anchor distT="0" distB="0" distL="114300" distR="114300" simplePos="0" relativeHeight="251670528" behindDoc="0" locked="0" layoutInCell="1" allowOverlap="1" wp14:anchorId="256BB765" wp14:editId="5D7B21E6">
                 <wp:simplePos x="0" y="0"/>
                 <wp:positionH relativeFrom="column">
                   <wp:posOffset>511791</wp:posOffset>
@@ -3762,7 +3243,27 @@
                                 <w:szCs w:val="20"/>
                                 <w:lang w:val="en-US"/>
                               </w:rPr>
-                              <w:t>Supplementary (n=22)</w:t>
+                              <w:t>Supplementary (n=</w:t>
+                            </w:r>
+                            <w:r>
+                              <w:rPr>
+                                <w:rFonts w:ascii="Arial" w:hAnsi="Arial" w:cs="Arial"/>
+                                <w:color w:val="000000" w:themeColor="text1"/>
+                                <w:sz w:val="18"/>
+                                <w:szCs w:val="20"/>
+                                <w:lang w:val="en-US"/>
+                              </w:rPr>
+                              <w:t>22</w:t>
+                            </w:r>
+                            <w:r>
+                              <w:rPr>
+                                <w:rFonts w:ascii="Arial" w:hAnsi="Arial" w:cs="Arial"/>
+                                <w:color w:val="000000" w:themeColor="text1"/>
+                                <w:sz w:val="18"/>
+                                <w:szCs w:val="20"/>
+                                <w:lang w:val="en-US"/>
+                              </w:rPr>
+                              <w:t>)</w:t>
                             </w:r>
                           </w:p>
                           <w:p>
@@ -3798,7 +3299,7 @@
           </mc:Choice>
           <mc:Fallback>
             <w:pict>
-              <v:rect w14:anchorId="256BB765" id="Rectangle 8" o:spid="_x0000_s1035" style="position:absolute;margin-left:40.3pt;margin-top:5.2pt;width:152.35pt;height:69.3pt;z-index:251670528;visibility:visible;mso-wrap-style:square;mso-width-percent:0;mso-height-percent:0;mso-wrap-distance-left:9pt;mso-wrap-distance-top:0;mso-wrap-distance-right:9pt;mso-wrap-distance-bottom:0;mso-position-horizontal:absolute;mso-position-horizontal-relative:text;mso-position-vertical:absolute;mso-position-vertical-relative:text;mso-width-percent:0;mso-height-percent:0;mso-width-relative:margin;mso-height-relative:margin;v-text-anchor:middle" o:gfxdata="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" filled="f" strokecolor="black [3213]" strokeweight="1pt">
+              <v:rect w14:anchorId="256BB765" id="Rectangle 8" o:spid="_x0000_s1034" style="position:absolute;margin-left:40.3pt;margin-top:5.2pt;width:152.35pt;height:69.3pt;z-index:251670528;visibility:visible;mso-wrap-style:square;mso-width-percent:0;mso-height-percent:0;mso-wrap-distance-left:9pt;mso-wrap-distance-top:0;mso-wrap-distance-right:9pt;mso-wrap-distance-bottom:0;mso-position-horizontal:absolute;mso-position-horizontal-relative:text;mso-position-vertical:absolute;mso-position-vertical-relative:text;mso-width-percent:0;mso-height-percent:0;mso-width-relative:margin;mso-height-relative:margin;v-text-anchor:middle" o:gfxdata="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" filled="f" strokecolor="black [3213]" strokeweight="1pt">
                 <v:textbox>
                   <w:txbxContent>
                     <w:p>
@@ -4009,7 +3510,27 @@
                           <w:szCs w:val="20"/>
                           <w:lang w:val="en-US"/>
                         </w:rPr>
-                        <w:t>Supplementary (n=22)</w:t>
+                        <w:t>Supplementary (n=</w:t>
+                      </w:r>
+                      <w:r>
+                        <w:rPr>
+                          <w:rFonts w:ascii="Arial" w:hAnsi="Arial" w:cs="Arial"/>
+                          <w:color w:val="000000" w:themeColor="text1"/>
+                          <w:sz w:val="18"/>
+                          <w:szCs w:val="20"/>
+                          <w:lang w:val="en-US"/>
+                        </w:rPr>
+                        <w:t>22</w:t>
+                      </w:r>
+                      <w:r>
+                        <w:rPr>
+                          <w:rFonts w:ascii="Arial" w:hAnsi="Arial" w:cs="Arial"/>
+                          <w:color w:val="000000" w:themeColor="text1"/>
+                          <w:sz w:val="18"/>
+                          <w:szCs w:val="20"/>
+                          <w:lang w:val="en-US"/>
+                        </w:rPr>
+                        <w:t>)</w:t>
                       </w:r>
                     </w:p>
                     <w:p>
@@ -4035,11 +3556,6 @@
       <w:pPr>
         <w:spacing w:after="0" w:line="240" w:lineRule="auto"/>
       </w:pPr>
-    </w:p>
-    <w:p>
-      <w:pPr>
-        <w:spacing w:after="0" w:line="240" w:lineRule="auto"/>
-      </w:pPr>
       <w:r>
         <w:rPr>
           <w:noProof/>
@@ -4047,16 +3563,545 @@
         <mc:AlternateContent>
           <mc:Choice Requires="wps">
             <w:drawing>
-              <wp:anchor distT="0" distB="0" distL="114300" distR="114300" simplePos="0" relativeHeight="251685888" behindDoc="0" locked="0" layoutInCell="1" allowOverlap="1" wp14:anchorId="2DFD1A2A" wp14:editId="4E78A56D">
+              <wp:anchor distT="0" distB="0" distL="114300" distR="114300" simplePos="0" relativeHeight="251671552" behindDoc="0" locked="0" layoutInCell="1" allowOverlap="1" wp14:anchorId="0A6784D8" wp14:editId="70E9DB5E">
                 <wp:simplePos x="0" y="0"/>
                 <wp:positionH relativeFrom="column">
-                  <wp:posOffset>2456597</wp:posOffset>
+                  <wp:posOffset>3063610</wp:posOffset>
                 </wp:positionH>
                 <wp:positionV relativeFrom="paragraph">
-                  <wp:posOffset>104453</wp:posOffset>
+                  <wp:posOffset>25239</wp:posOffset>
                 </wp:positionV>
-                <wp:extent cx="614149" cy="45719"/>
-                <wp:effectExtent l="0" t="38100" r="52705" b="88265"/>
+                <wp:extent cx="1887220" cy="744514"/>
+                <wp:effectExtent l="0" t="0" r="17780" b="17780"/>
+                <wp:wrapNone/>
+                <wp:docPr id="9" name="Rectangle 9"/>
+                <wp:cNvGraphicFramePr/>
+                <a:graphic xmlns:a="http://schemas.openxmlformats.org/drawingml/2006/main">
+                  <a:graphicData uri="http://schemas.microsoft.com/office/word/2010/wordprocessingShape">
+                    <wps:wsp>
+                      <wps:cNvSpPr/>
+                      <wps:spPr>
+                        <a:xfrm>
+                          <a:off x="0" y="0"/>
+                          <a:ext cx="1887220" cy="744514"/>
+                        </a:xfrm>
+                        <a:prstGeom prst="rect">
+                          <a:avLst/>
+                        </a:prstGeom>
+                        <a:noFill/>
+                        <a:ln>
+                          <a:solidFill>
+                            <a:schemeClr val="tx1"/>
+                          </a:solidFill>
+                        </a:ln>
+                      </wps:spPr>
+                      <wps:style>
+                        <a:lnRef idx="2">
+                          <a:schemeClr val="accent1">
+                            <a:shade val="50000"/>
+                          </a:schemeClr>
+                        </a:lnRef>
+                        <a:fillRef idx="1">
+                          <a:schemeClr val="accent1"/>
+                        </a:fillRef>
+                        <a:effectRef idx="0">
+                          <a:schemeClr val="accent1"/>
+                        </a:effectRef>
+                        <a:fontRef idx="minor">
+                          <a:schemeClr val="lt1"/>
+                        </a:fontRef>
+                      </wps:style>
+                      <wps:txbx>
+                        <w:txbxContent>
+                          <w:p>
+                            <w:pPr>
+                              <w:spacing w:after="0" w:line="240" w:lineRule="auto"/>
+                              <w:rPr>
+                                <w:rFonts w:ascii="Arial" w:hAnsi="Arial" w:cs="Arial"/>
+                                <w:color w:val="000000" w:themeColor="text1"/>
+                                <w:sz w:val="18"/>
+                                <w:szCs w:val="20"/>
+                              </w:rPr>
+                            </w:pPr>
+                            <w:r>
+                              <w:rPr>
+                                <w:rFonts w:ascii="Arial" w:hAnsi="Arial" w:cs="Arial"/>
+                                <w:color w:val="000000" w:themeColor="text1"/>
+                                <w:sz w:val="18"/>
+                                <w:szCs w:val="20"/>
+                              </w:rPr>
+                              <w:t>Re</w:t>
+                            </w:r>
+                            <w:r>
+                              <w:rPr>
+                                <w:rFonts w:ascii="Arial" w:hAnsi="Arial" w:cs="Arial"/>
+                                <w:color w:val="000000" w:themeColor="text1"/>
+                                <w:sz w:val="18"/>
+                                <w:szCs w:val="20"/>
+                              </w:rPr>
+                              <w:t>p</w:t>
+                            </w:r>
+                            <w:r>
+                              <w:rPr>
+                                <w:rFonts w:ascii="Arial" w:hAnsi="Arial" w:cs="Arial"/>
+                                <w:color w:val="000000" w:themeColor="text1"/>
+                                <w:sz w:val="18"/>
+                                <w:szCs w:val="20"/>
+                              </w:rPr>
+                              <w:t>or</w:t>
+                            </w:r>
+                            <w:r>
+                              <w:rPr>
+                                <w:rFonts w:ascii="Arial" w:hAnsi="Arial" w:cs="Arial"/>
+                                <w:color w:val="000000" w:themeColor="text1"/>
+                                <w:sz w:val="18"/>
+                                <w:szCs w:val="20"/>
+                              </w:rPr>
+                              <w:t>t</w:t>
+                            </w:r>
+                            <w:r>
+                              <w:rPr>
+                                <w:rFonts w:ascii="Arial" w:hAnsi="Arial" w:cs="Arial"/>
+                                <w:color w:val="000000" w:themeColor="text1"/>
+                                <w:sz w:val="18"/>
+                                <w:szCs w:val="20"/>
+                              </w:rPr>
+                              <w:t>s</w:t>
+                            </w:r>
+                            <w:r>
+                              <w:rPr>
+                                <w:rFonts w:ascii="Arial" w:hAnsi="Arial" w:cs="Arial"/>
+                                <w:color w:val="000000" w:themeColor="text1"/>
+                                <w:sz w:val="18"/>
+                                <w:szCs w:val="20"/>
+                              </w:rPr>
+                              <w:t xml:space="preserve"> excluded</w:t>
+                            </w:r>
+                            <w:r>
+                              <w:rPr>
+                                <w:rFonts w:ascii="Arial" w:hAnsi="Arial" w:cs="Arial"/>
+                                <w:color w:val="000000" w:themeColor="text1"/>
+                                <w:sz w:val="18"/>
+                                <w:szCs w:val="20"/>
+                              </w:rPr>
+                              <w:t>:</w:t>
+                            </w:r>
+                          </w:p>
+                          <w:p>
+                            <w:pPr>
+                              <w:spacing w:after="0" w:line="240" w:lineRule="auto"/>
+                              <w:ind w:left="284"/>
+                              <w:rPr>
+                                <w:rFonts w:ascii="Arial" w:hAnsi="Arial" w:cs="Arial"/>
+                                <w:color w:val="000000" w:themeColor="text1"/>
+                                <w:sz w:val="18"/>
+                                <w:szCs w:val="20"/>
+                              </w:rPr>
+                            </w:pPr>
+                            <w:r>
+                              <w:rPr>
+                                <w:rFonts w:ascii="Arial" w:hAnsi="Arial" w:cs="Arial"/>
+                                <w:color w:val="000000" w:themeColor="text1"/>
+                                <w:sz w:val="18"/>
+                                <w:szCs w:val="20"/>
+                              </w:rPr>
+                              <w:t>Not relevant</w:t>
+                            </w:r>
+                            <w:r>
+                              <w:rPr>
+                                <w:rFonts w:ascii="Arial" w:hAnsi="Arial" w:cs="Arial"/>
+                                <w:color w:val="000000" w:themeColor="text1"/>
+                                <w:sz w:val="18"/>
+                                <w:szCs w:val="20"/>
+                              </w:rPr>
+                              <w:t xml:space="preserve"> (</w:t>
+                            </w:r>
+                            <w:r>
+                              <w:rPr>
+                                <w:rFonts w:ascii="Arial" w:hAnsi="Arial" w:cs="Arial"/>
+                                <w:color w:val="000000" w:themeColor="text1"/>
+                                <w:sz w:val="18"/>
+                                <w:szCs w:val="20"/>
+                              </w:rPr>
+                              <w:t>n</w:t>
+                            </w:r>
+                            <w:r>
+                              <w:rPr>
+                                <w:rFonts w:ascii="Arial" w:hAnsi="Arial" w:cs="Arial"/>
+                                <w:color w:val="000000" w:themeColor="text1"/>
+                                <w:sz w:val="18"/>
+                                <w:szCs w:val="20"/>
+                              </w:rPr>
+                              <w:t xml:space="preserve"> = </w:t>
+                            </w:r>
+                            <w:r>
+                              <w:rPr>
+                                <w:rFonts w:ascii="Arial" w:hAnsi="Arial" w:cs="Arial"/>
+                                <w:color w:val="000000" w:themeColor="text1"/>
+                                <w:sz w:val="18"/>
+                                <w:szCs w:val="20"/>
+                              </w:rPr>
+                              <w:t>17</w:t>
+                            </w:r>
+                            <w:r>
+                              <w:rPr>
+                                <w:rFonts w:ascii="Arial" w:hAnsi="Arial" w:cs="Arial"/>
+                                <w:color w:val="000000" w:themeColor="text1"/>
+                                <w:sz w:val="18"/>
+                                <w:szCs w:val="20"/>
+                              </w:rPr>
+                              <w:t>7</w:t>
+                            </w:r>
+                            <w:r>
+                              <w:rPr>
+                                <w:rFonts w:ascii="Arial" w:hAnsi="Arial" w:cs="Arial"/>
+                                <w:color w:val="000000" w:themeColor="text1"/>
+                                <w:sz w:val="18"/>
+                                <w:szCs w:val="20"/>
+                              </w:rPr>
+                              <w:t>)</w:t>
+                            </w:r>
+                          </w:p>
+                          <w:p>
+                            <w:pPr>
+                              <w:spacing w:after="0" w:line="240" w:lineRule="auto"/>
+                              <w:ind w:left="284"/>
+                              <w:rPr>
+                                <w:rFonts w:ascii="Arial" w:hAnsi="Arial" w:cs="Arial"/>
+                                <w:color w:val="000000" w:themeColor="text1"/>
+                                <w:sz w:val="18"/>
+                                <w:szCs w:val="20"/>
+                              </w:rPr>
+                            </w:pPr>
+                            <w:r>
+                              <w:rPr>
+                                <w:rFonts w:ascii="Arial" w:hAnsi="Arial" w:cs="Arial"/>
+                                <w:color w:val="000000" w:themeColor="text1"/>
+                                <w:sz w:val="18"/>
+                                <w:szCs w:val="20"/>
+                              </w:rPr>
+                              <w:t xml:space="preserve">No empirical contribution </w:t>
+                            </w:r>
+                            <w:r>
+                              <w:rPr>
+                                <w:rFonts w:ascii="Arial" w:hAnsi="Arial" w:cs="Arial"/>
+                                <w:color w:val="000000" w:themeColor="text1"/>
+                                <w:sz w:val="18"/>
+                                <w:szCs w:val="20"/>
+                              </w:rPr>
+                              <w:t>(</w:t>
+                            </w:r>
+                            <w:r>
+                              <w:rPr>
+                                <w:rFonts w:ascii="Arial" w:hAnsi="Arial" w:cs="Arial"/>
+                                <w:color w:val="000000" w:themeColor="text1"/>
+                                <w:sz w:val="18"/>
+                                <w:szCs w:val="20"/>
+                              </w:rPr>
+                              <w:t>n</w:t>
+                            </w:r>
+                            <w:r>
+                              <w:rPr>
+                                <w:rFonts w:ascii="Arial" w:hAnsi="Arial" w:cs="Arial"/>
+                                <w:color w:val="000000" w:themeColor="text1"/>
+                                <w:sz w:val="18"/>
+                                <w:szCs w:val="20"/>
+                              </w:rPr>
+                              <w:t xml:space="preserve"> = </w:t>
+                            </w:r>
+                            <w:r>
+                              <w:rPr>
+                                <w:rFonts w:ascii="Arial" w:hAnsi="Arial" w:cs="Arial"/>
+                                <w:color w:val="000000" w:themeColor="text1"/>
+                                <w:sz w:val="18"/>
+                                <w:szCs w:val="20"/>
+                              </w:rPr>
+                              <w:t>40</w:t>
+                            </w:r>
+                            <w:r>
+                              <w:rPr>
+                                <w:rFonts w:ascii="Arial" w:hAnsi="Arial" w:cs="Arial"/>
+                                <w:color w:val="000000" w:themeColor="text1"/>
+                                <w:sz w:val="18"/>
+                                <w:szCs w:val="20"/>
+                              </w:rPr>
+                              <w:t>)</w:t>
+                            </w:r>
+                          </w:p>
+                        </w:txbxContent>
+                      </wps:txbx>
+                      <wps:bodyPr rot="0" spcFirstLastPara="0" vertOverflow="overflow" horzOverflow="overflow" vert="horz" wrap="square" lIns="91440" tIns="45720" rIns="91440" bIns="45720" numCol="1" spcCol="0" rtlCol="0" fromWordArt="0" anchor="ctr" anchorCtr="0" forceAA="0" compatLnSpc="1">
+                        <a:prstTxWarp prst="textNoShape">
+                          <a:avLst/>
+                        </a:prstTxWarp>
+                        <a:noAutofit/>
+                      </wps:bodyPr>
+                    </wps:wsp>
+                  </a:graphicData>
+                </a:graphic>
+                <wp14:sizeRelH relativeFrom="margin">
+                  <wp14:pctWidth>0</wp14:pctWidth>
+                </wp14:sizeRelH>
+                <wp14:sizeRelV relativeFrom="margin">
+                  <wp14:pctHeight>0</wp14:pctHeight>
+                </wp14:sizeRelV>
+              </wp:anchor>
+            </w:drawing>
+          </mc:Choice>
+          <mc:Fallback>
+            <w:pict>
+              <v:rect w14:anchorId="0A6784D8" id="Rectangle 9" o:spid="_x0000_s1035" style="position:absolute;margin-left:241.25pt;margin-top:2pt;width:148.6pt;height:58.6pt;z-index:251671552;visibility:visible;mso-wrap-style:square;mso-width-percent:0;mso-height-percent:0;mso-wrap-distance-left:9pt;mso-wrap-distance-top:0;mso-wrap-distance-right:9pt;mso-wrap-distance-bottom:0;mso-position-horizontal:absolute;mso-position-horizontal-relative:text;mso-position-vertical:absolute;mso-position-vertical-relative:text;mso-width-percent:0;mso-height-percent:0;mso-width-relative:margin;mso-height-relative:margin;v-text-anchor:middle" o:gfxdata="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" filled="f" strokecolor="black [3213]" strokeweight="1pt">
+                <v:textbox>
+                  <w:txbxContent>
+                    <w:p>
+                      <w:pPr>
+                        <w:spacing w:after="0" w:line="240" w:lineRule="auto"/>
+                        <w:rPr>
+                          <w:rFonts w:ascii="Arial" w:hAnsi="Arial" w:cs="Arial"/>
+                          <w:color w:val="000000" w:themeColor="text1"/>
+                          <w:sz w:val="18"/>
+                          <w:szCs w:val="20"/>
+                        </w:rPr>
+                      </w:pPr>
+                      <w:r>
+                        <w:rPr>
+                          <w:rFonts w:ascii="Arial" w:hAnsi="Arial" w:cs="Arial"/>
+                          <w:color w:val="000000" w:themeColor="text1"/>
+                          <w:sz w:val="18"/>
+                          <w:szCs w:val="20"/>
+                        </w:rPr>
+                        <w:t>Re</w:t>
+                      </w:r>
+                      <w:r>
+                        <w:rPr>
+                          <w:rFonts w:ascii="Arial" w:hAnsi="Arial" w:cs="Arial"/>
+                          <w:color w:val="000000" w:themeColor="text1"/>
+                          <w:sz w:val="18"/>
+                          <w:szCs w:val="20"/>
+                        </w:rPr>
+                        <w:t>p</w:t>
+                      </w:r>
+                      <w:r>
+                        <w:rPr>
+                          <w:rFonts w:ascii="Arial" w:hAnsi="Arial" w:cs="Arial"/>
+                          <w:color w:val="000000" w:themeColor="text1"/>
+                          <w:sz w:val="18"/>
+                          <w:szCs w:val="20"/>
+                        </w:rPr>
+                        <w:t>or</w:t>
+                      </w:r>
+                      <w:r>
+                        <w:rPr>
+                          <w:rFonts w:ascii="Arial" w:hAnsi="Arial" w:cs="Arial"/>
+                          <w:color w:val="000000" w:themeColor="text1"/>
+                          <w:sz w:val="18"/>
+                          <w:szCs w:val="20"/>
+                        </w:rPr>
+                        <w:t>t</w:t>
+                      </w:r>
+                      <w:r>
+                        <w:rPr>
+                          <w:rFonts w:ascii="Arial" w:hAnsi="Arial" w:cs="Arial"/>
+                          <w:color w:val="000000" w:themeColor="text1"/>
+                          <w:sz w:val="18"/>
+                          <w:szCs w:val="20"/>
+                        </w:rPr>
+                        <w:t>s</w:t>
+                      </w:r>
+                      <w:r>
+                        <w:rPr>
+                          <w:rFonts w:ascii="Arial" w:hAnsi="Arial" w:cs="Arial"/>
+                          <w:color w:val="000000" w:themeColor="text1"/>
+                          <w:sz w:val="18"/>
+                          <w:szCs w:val="20"/>
+                        </w:rPr>
+                        <w:t xml:space="preserve"> excluded</w:t>
+                      </w:r>
+                      <w:r>
+                        <w:rPr>
+                          <w:rFonts w:ascii="Arial" w:hAnsi="Arial" w:cs="Arial"/>
+                          <w:color w:val="000000" w:themeColor="text1"/>
+                          <w:sz w:val="18"/>
+                          <w:szCs w:val="20"/>
+                        </w:rPr>
+                        <w:t>:</w:t>
+                      </w:r>
+                    </w:p>
+                    <w:p>
+                      <w:pPr>
+                        <w:spacing w:after="0" w:line="240" w:lineRule="auto"/>
+                        <w:ind w:left="284"/>
+                        <w:rPr>
+                          <w:rFonts w:ascii="Arial" w:hAnsi="Arial" w:cs="Arial"/>
+                          <w:color w:val="000000" w:themeColor="text1"/>
+                          <w:sz w:val="18"/>
+                          <w:szCs w:val="20"/>
+                        </w:rPr>
+                      </w:pPr>
+                      <w:r>
+                        <w:rPr>
+                          <w:rFonts w:ascii="Arial" w:hAnsi="Arial" w:cs="Arial"/>
+                          <w:color w:val="000000" w:themeColor="text1"/>
+                          <w:sz w:val="18"/>
+                          <w:szCs w:val="20"/>
+                        </w:rPr>
+                        <w:t>Not relevant</w:t>
+                      </w:r>
+                      <w:r>
+                        <w:rPr>
+                          <w:rFonts w:ascii="Arial" w:hAnsi="Arial" w:cs="Arial"/>
+                          <w:color w:val="000000" w:themeColor="text1"/>
+                          <w:sz w:val="18"/>
+                          <w:szCs w:val="20"/>
+                        </w:rPr>
+                        <w:t xml:space="preserve"> (</w:t>
+                      </w:r>
+                      <w:r>
+                        <w:rPr>
+                          <w:rFonts w:ascii="Arial" w:hAnsi="Arial" w:cs="Arial"/>
+                          <w:color w:val="000000" w:themeColor="text1"/>
+                          <w:sz w:val="18"/>
+                          <w:szCs w:val="20"/>
+                        </w:rPr>
+                        <w:t>n</w:t>
+                      </w:r>
+                      <w:r>
+                        <w:rPr>
+                          <w:rFonts w:ascii="Arial" w:hAnsi="Arial" w:cs="Arial"/>
+                          <w:color w:val="000000" w:themeColor="text1"/>
+                          <w:sz w:val="18"/>
+                          <w:szCs w:val="20"/>
+                        </w:rPr>
+                        <w:t xml:space="preserve"> = </w:t>
+                      </w:r>
+                      <w:r>
+                        <w:rPr>
+                          <w:rFonts w:ascii="Arial" w:hAnsi="Arial" w:cs="Arial"/>
+                          <w:color w:val="000000" w:themeColor="text1"/>
+                          <w:sz w:val="18"/>
+                          <w:szCs w:val="20"/>
+                        </w:rPr>
+                        <w:t>17</w:t>
+                      </w:r>
+                      <w:r>
+                        <w:rPr>
+                          <w:rFonts w:ascii="Arial" w:hAnsi="Arial" w:cs="Arial"/>
+                          <w:color w:val="000000" w:themeColor="text1"/>
+                          <w:sz w:val="18"/>
+                          <w:szCs w:val="20"/>
+                        </w:rPr>
+                        <w:t>7</w:t>
+                      </w:r>
+                      <w:r>
+                        <w:rPr>
+                          <w:rFonts w:ascii="Arial" w:hAnsi="Arial" w:cs="Arial"/>
+                          <w:color w:val="000000" w:themeColor="text1"/>
+                          <w:sz w:val="18"/>
+                          <w:szCs w:val="20"/>
+                        </w:rPr>
+                        <w:t>)</w:t>
+                      </w:r>
+                    </w:p>
+                    <w:p>
+                      <w:pPr>
+                        <w:spacing w:after="0" w:line="240" w:lineRule="auto"/>
+                        <w:ind w:left="284"/>
+                        <w:rPr>
+                          <w:rFonts w:ascii="Arial" w:hAnsi="Arial" w:cs="Arial"/>
+                          <w:color w:val="000000" w:themeColor="text1"/>
+                          <w:sz w:val="18"/>
+                          <w:szCs w:val="20"/>
+                        </w:rPr>
+                      </w:pPr>
+                      <w:r>
+                        <w:rPr>
+                          <w:rFonts w:ascii="Arial" w:hAnsi="Arial" w:cs="Arial"/>
+                          <w:color w:val="000000" w:themeColor="text1"/>
+                          <w:sz w:val="18"/>
+                          <w:szCs w:val="20"/>
+                        </w:rPr>
+                        <w:t xml:space="preserve">No empirical contribution </w:t>
+                      </w:r>
+                      <w:r>
+                        <w:rPr>
+                          <w:rFonts w:ascii="Arial" w:hAnsi="Arial" w:cs="Arial"/>
+                          <w:color w:val="000000" w:themeColor="text1"/>
+                          <w:sz w:val="18"/>
+                          <w:szCs w:val="20"/>
+                        </w:rPr>
+                        <w:t>(</w:t>
+                      </w:r>
+                      <w:r>
+                        <w:rPr>
+                          <w:rFonts w:ascii="Arial" w:hAnsi="Arial" w:cs="Arial"/>
+                          <w:color w:val="000000" w:themeColor="text1"/>
+                          <w:sz w:val="18"/>
+                          <w:szCs w:val="20"/>
+                        </w:rPr>
+                        <w:t>n</w:t>
+                      </w:r>
+                      <w:r>
+                        <w:rPr>
+                          <w:rFonts w:ascii="Arial" w:hAnsi="Arial" w:cs="Arial"/>
+                          <w:color w:val="000000" w:themeColor="text1"/>
+                          <w:sz w:val="18"/>
+                          <w:szCs w:val="20"/>
+                        </w:rPr>
+                        <w:t xml:space="preserve"> = </w:t>
+                      </w:r>
+                      <w:r>
+                        <w:rPr>
+                          <w:rFonts w:ascii="Arial" w:hAnsi="Arial" w:cs="Arial"/>
+                          <w:color w:val="000000" w:themeColor="text1"/>
+                          <w:sz w:val="18"/>
+                          <w:szCs w:val="20"/>
+                        </w:rPr>
+                        <w:t>40</w:t>
+                      </w:r>
+                      <w:r>
+                        <w:rPr>
+                          <w:rFonts w:ascii="Arial" w:hAnsi="Arial" w:cs="Arial"/>
+                          <w:color w:val="000000" w:themeColor="text1"/>
+                          <w:sz w:val="18"/>
+                          <w:szCs w:val="20"/>
+                        </w:rPr>
+                        <w:t>)</w:t>
+                      </w:r>
+                    </w:p>
+                  </w:txbxContent>
+                </v:textbox>
+              </v:rect>
+            </w:pict>
+          </mc:Fallback>
+        </mc:AlternateContent>
+      </w:r>
+    </w:p>
+    <w:p>
+      <w:pPr>
+        <w:spacing w:after="0" w:line="240" w:lineRule="auto"/>
+      </w:pPr>
+    </w:p>
+    <w:p>
+      <w:pPr>
+        <w:spacing w:after="0" w:line="240" w:lineRule="auto"/>
+      </w:pPr>
+      <w:r>
+        <w:rPr>
+          <w:noProof/>
+        </w:rPr>
+        <mc:AlternateContent>
+          <mc:Choice Requires="wps">
+            <w:drawing>
+              <wp:anchor distT="0" distB="0" distL="114300" distR="114300" simplePos="0" relativeHeight="251685888" behindDoc="0" locked="0" layoutInCell="1" allowOverlap="1" wp14:anchorId="2DFD1A2A" wp14:editId="686879D3">
+                <wp:simplePos x="0" y="0"/>
+                <wp:positionH relativeFrom="column">
+                  <wp:posOffset>2441103</wp:posOffset>
+                </wp:positionH>
+                <wp:positionV relativeFrom="paragraph">
+                  <wp:posOffset>15525</wp:posOffset>
+                </wp:positionV>
+                <wp:extent cx="625256" cy="45719"/>
+                <wp:effectExtent l="0" t="38100" r="41910" b="88265"/>
                 <wp:wrapNone/>
                 <wp:docPr id="17" name="Straight Arrow Connector 17"/>
                 <wp:cNvGraphicFramePr/>
@@ -4067,7 +4112,7 @@
                       <wps:spPr>
                         <a:xfrm>
                           <a:off x="0" y="0"/>
-                          <a:ext cx="614149" cy="45719"/>
+                          <a:ext cx="625256" cy="45719"/>
                         </a:xfrm>
                         <a:prstGeom prst="straightConnector1">
                           <a:avLst/>
@@ -4108,18 +4153,17 @@
           </mc:Choice>
           <mc:Fallback>
             <w:pict>
-              <v:shape w14:anchorId="3A6F86D0" id="Straight Arrow Connector 17" o:spid="_x0000_s1026" type="#_x0000_t32" style="position:absolute;margin-left:193.45pt;margin-top:8.2pt;width:48.35pt;height:3.6pt;z-index:251685888;visibility:visible;mso-wrap-style:square;mso-width-percent:0;mso-height-percent:0;mso-wrap-distance-left:9pt;mso-wrap-distance-top:0;mso-wrap-distance-right:9pt;mso-wrap-distance-bottom:0;mso-position-horizontal:absolute;mso-position-horizontal-relative:text;mso-position-vertical:absolute;mso-position-vertical-relative:text;mso-width-percent:0;mso-height-percent:0;mso-width-relative:margin;mso-height-relative:margin" o:gfxdata="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" strokecolor="black [3213]" strokeweight=".5pt">
+              <v:shapetype w14:anchorId="7C43B8FF" id="_x0000_t32" coordsize="21600,21600" o:spt="32" o:oned="t" path="m,l21600,21600e" filled="f">
+                <v:path arrowok="t" fillok="f" o:connecttype="none"/>
+                <o:lock v:ext="edit" shapetype="t"/>
+              </v:shapetype>
+              <v:shape id="Straight Arrow Connector 17" o:spid="_x0000_s1026" type="#_x0000_t32" style="position:absolute;margin-left:192.2pt;margin-top:1.2pt;width:49.25pt;height:3.6pt;z-index:251685888;visibility:visible;mso-wrap-style:square;mso-width-percent:0;mso-height-percent:0;mso-wrap-distance-left:9pt;mso-wrap-distance-top:0;mso-wrap-distance-right:9pt;mso-wrap-distance-bottom:0;mso-position-horizontal:absolute;mso-position-horizontal-relative:text;mso-position-vertical:absolute;mso-position-vertical-relative:text;mso-width-percent:0;mso-height-percent:0;mso-width-relative:margin;mso-height-relative:margin" o:gfxdata="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" strokecolor="black [3213]" strokeweight=".5pt">
                 <v:stroke endarrow="block" joinstyle="miter"/>
               </v:shape>
             </w:pict>
           </mc:Fallback>
         </mc:AlternateContent>
       </w:r>
-    </w:p>
-    <w:p>
-      <w:pPr>
-        <w:spacing w:after="0" w:line="240" w:lineRule="auto"/>
-      </w:pPr>
     </w:p>
     <w:p>
       <w:pPr>
@@ -4217,16 +4261,16 @@
         <mc:AlternateContent>
           <mc:Choice Requires="wps">
             <w:drawing>
-              <wp:anchor distT="0" distB="0" distL="114300" distR="114300" simplePos="0" relativeHeight="251678720" behindDoc="0" locked="0" layoutInCell="1" allowOverlap="1" wp14:anchorId="2957DE69" wp14:editId="581881A8">
+              <wp:anchor distT="0" distB="0" distL="114300" distR="114300" simplePos="0" relativeHeight="251678720" behindDoc="0" locked="0" layoutInCell="1" allowOverlap="1" wp14:anchorId="2957DE69" wp14:editId="6F27D42B">
                 <wp:simplePos x="0" y="0"/>
                 <wp:positionH relativeFrom="column">
-                  <wp:posOffset>539087</wp:posOffset>
+                  <wp:posOffset>536713</wp:posOffset>
                 </wp:positionH>
                 <wp:positionV relativeFrom="paragraph">
-                  <wp:posOffset>107694</wp:posOffset>
+                  <wp:posOffset>106211</wp:posOffset>
                 </wp:positionV>
-                <wp:extent cx="1887220" cy="893928"/>
-                <wp:effectExtent l="0" t="0" r="17780" b="20955"/>
+                <wp:extent cx="1887220" cy="906448"/>
+                <wp:effectExtent l="0" t="0" r="17780" b="27305"/>
                 <wp:wrapNone/>
                 <wp:docPr id="13" name="Rectangle 13"/>
                 <wp:cNvGraphicFramePr/>
@@ -4237,7 +4281,7 @@
                       <wps:spPr>
                         <a:xfrm>
                           <a:off x="0" y="0"/>
-                          <a:ext cx="1887220" cy="893928"/>
+                          <a:ext cx="1887220" cy="906448"/>
                         </a:xfrm>
                         <a:prstGeom prst="rect">
                           <a:avLst/>
@@ -4331,7 +4375,16 @@
                                 <w:sz w:val="18"/>
                                 <w:szCs w:val="20"/>
                               </w:rPr>
-                              <w:t>37</w:t>
+                              <w:t>3</w:t>
+                            </w:r>
+                            <w:r>
+                              <w:rPr>
+                                <w:rFonts w:ascii="Arial" w:hAnsi="Arial" w:cs="Arial"/>
+                                <w:color w:val="000000" w:themeColor="text1"/>
+                                <w:sz w:val="18"/>
+                                <w:szCs w:val="20"/>
+                              </w:rPr>
+                              <w:t>3</w:t>
                             </w:r>
                             <w:r>
                               <w:rPr>
@@ -4441,7 +4494,37 @@
                                 <w:szCs w:val="20"/>
                                 <w:lang w:val="en-US"/>
                               </w:rPr>
-                              <w:t>Supplementary (n=22)</w:t>
+                              <w:t>Supplementary (n=</w:t>
+                            </w:r>
+                            <w:r>
+                              <w:rPr>
+                                <w:rFonts w:ascii="Arial" w:hAnsi="Arial" w:cs="Arial"/>
+                                <w:color w:val="000000" w:themeColor="text1"/>
+                                <w:sz w:val="18"/>
+                                <w:szCs w:val="20"/>
+                                <w:lang w:val="en-US"/>
+                              </w:rPr>
+                              <w:t>1</w:t>
+                            </w:r>
+                            <w:r>
+                              <w:rPr>
+                                <w:rFonts w:ascii="Arial" w:hAnsi="Arial" w:cs="Arial"/>
+                                <w:color w:val="000000" w:themeColor="text1"/>
+                                <w:sz w:val="18"/>
+                                <w:szCs w:val="20"/>
+                                <w:lang w:val="en-US"/>
+                              </w:rPr>
+                              <w:t>8</w:t>
+                            </w:r>
+                            <w:r>
+                              <w:rPr>
+                                <w:rFonts w:ascii="Arial" w:hAnsi="Arial" w:cs="Arial"/>
+                                <w:color w:val="000000" w:themeColor="text1"/>
+                                <w:sz w:val="18"/>
+                                <w:szCs w:val="20"/>
+                                <w:lang w:val="en-US"/>
+                              </w:rPr>
+                              <w:t>)</w:t>
                             </w:r>
                           </w:p>
                           <w:p>
@@ -4477,7 +4560,7 @@
           </mc:Choice>
           <mc:Fallback>
             <w:pict>
-              <v:rect w14:anchorId="2957DE69" id="Rectangle 13" o:spid="_x0000_s1036" style="position:absolute;margin-left:42.45pt;margin-top:8.5pt;width:148.6pt;height:70.4pt;z-index:251678720;visibility:visible;mso-wrap-style:square;mso-width-percent:0;mso-height-percent:0;mso-wrap-distance-left:9pt;mso-wrap-distance-top:0;mso-wrap-distance-right:9pt;mso-wrap-distance-bottom:0;mso-position-horizontal:absolute;mso-position-horizontal-relative:text;mso-position-vertical:absolute;mso-position-vertical-relative:text;mso-width-percent:0;mso-height-percent:0;mso-width-relative:margin;mso-height-relative:margin;v-text-anchor:middle" o:gfxdata="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" filled="f" strokecolor="black [3213]" strokeweight="1pt">
+              <v:rect w14:anchorId="2957DE69" id="Rectangle 13" o:spid="_x0000_s1036" style="position:absolute;margin-left:42.25pt;margin-top:8.35pt;width:148.6pt;height:71.35pt;z-index:251678720;visibility:visible;mso-wrap-style:square;mso-width-percent:0;mso-height-percent:0;mso-wrap-distance-left:9pt;mso-wrap-distance-top:0;mso-wrap-distance-right:9pt;mso-wrap-distance-bottom:0;mso-position-horizontal:absolute;mso-position-horizontal-relative:text;mso-position-vertical:absolute;mso-position-vertical-relative:text;mso-width-percent:0;mso-height-percent:0;mso-width-relative:margin;mso-height-relative:margin;v-text-anchor:middle" o:gfxdata="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" filled="f" strokecolor="black [3213]" strokeweight="1pt">
                 <v:textbox>
                   <w:txbxContent>
                     <w:p>
@@ -4544,7 +4627,16 @@
                           <w:sz w:val="18"/>
                           <w:szCs w:val="20"/>
                         </w:rPr>
-                        <w:t>37</w:t>
+                        <w:t>3</w:t>
+                      </w:r>
+                      <w:r>
+                        <w:rPr>
+                          <w:rFonts w:ascii="Arial" w:hAnsi="Arial" w:cs="Arial"/>
+                          <w:color w:val="000000" w:themeColor="text1"/>
+                          <w:sz w:val="18"/>
+                          <w:szCs w:val="20"/>
+                        </w:rPr>
+                        <w:t>3</w:t>
                       </w:r>
                       <w:r>
                         <w:rPr>
@@ -4654,7 +4746,37 @@
                           <w:szCs w:val="20"/>
                           <w:lang w:val="en-US"/>
                         </w:rPr>
-                        <w:t>Supplementary (n=22)</w:t>
+                        <w:t>Supplementary (n=</w:t>
+                      </w:r>
+                      <w:r>
+                        <w:rPr>
+                          <w:rFonts w:ascii="Arial" w:hAnsi="Arial" w:cs="Arial"/>
+                          <w:color w:val="000000" w:themeColor="text1"/>
+                          <w:sz w:val="18"/>
+                          <w:szCs w:val="20"/>
+                          <w:lang w:val="en-US"/>
+                        </w:rPr>
+                        <w:t>1</w:t>
+                      </w:r>
+                      <w:r>
+                        <w:rPr>
+                          <w:rFonts w:ascii="Arial" w:hAnsi="Arial" w:cs="Arial"/>
+                          <w:color w:val="000000" w:themeColor="text1"/>
+                          <w:sz w:val="18"/>
+                          <w:szCs w:val="20"/>
+                          <w:lang w:val="en-US"/>
+                        </w:rPr>
+                        <w:t>8</w:t>
+                      </w:r>
+                      <w:r>
+                        <w:rPr>
+                          <w:rFonts w:ascii="Arial" w:hAnsi="Arial" w:cs="Arial"/>
+                          <w:color w:val="000000" w:themeColor="text1"/>
+                          <w:sz w:val="18"/>
+                          <w:szCs w:val="20"/>
+                          <w:lang w:val="en-US"/>
+                        </w:rPr>
+                        <w:t>)</w:t>
                       </w:r>
                     </w:p>
                     <w:p>
@@ -5109,7 +5231,27 @@
           <w:sz w:val="18"/>
           <w:szCs w:val="20"/>
         </w:rPr>
-        <w:t>Page MJ, et al. BMJ 2021;372:n71. doi: 10.1136/bmj.n71.</w:t>
+        <w:t xml:space="preserve">Page MJ, et al. BMJ 2021;372:n71. </w:t>
+      </w:r>
+      <w:proofErr w:type="spellStart"/>
+      <w:r>
+        <w:rPr>
+          <w:rFonts w:ascii="Arial" w:hAnsi="Arial" w:cs="Arial"/>
+          <w:color w:val="000000" w:themeColor="text1"/>
+          <w:sz w:val="18"/>
+          <w:szCs w:val="20"/>
+        </w:rPr>
+        <w:t>doi</w:t>
+      </w:r>
+      <w:proofErr w:type="spellEnd"/>
+      <w:r>
+        <w:rPr>
+          <w:rFonts w:ascii="Arial" w:hAnsi="Arial" w:cs="Arial"/>
+          <w:color w:val="000000" w:themeColor="text1"/>
+          <w:sz w:val="18"/>
+          <w:szCs w:val="20"/>
+        </w:rPr>
+        <w:t>: 10.1136/bmj.n71.</w:t>
       </w:r>
     </w:p>
     <w:p>

</xml_diff>